<commit_message>
Documento RS y plantilla con logos
</commit_message>
<xml_diff>
--- a/Documentación/Requisitos de Software.docx
+++ b/Documentación/Requisitos de Software.docx
@@ -474,21 +474,7 @@
               <w:rPr>
                 <w:b/>
               </w:rPr>
-              <w:t xml:space="preserve">Verificado </w:t>
-            </w:r>
-            <w:proofErr w:type="spellStart"/>
-            <w:r>
-              <w:rPr>
-                <w:b/>
-              </w:rPr>
-              <w:t>dep</w:t>
-            </w:r>
-            <w:proofErr w:type="spellEnd"/>
-            <w:r>
-              <w:rPr>
-                <w:b/>
-              </w:rPr>
-              <w:t>. calidad.</w:t>
+              <w:t>Verificado dep. calidad.</w:t>
             </w:r>
           </w:p>
         </w:tc>
@@ -842,33 +828,8 @@
                 <w:rFonts w:cs="Arial"/>
                 <w:lang w:val="fr-FR"/>
               </w:rPr>
-              <w:t xml:space="preserve">Por la </w:t>
-            </w:r>
-            <w:proofErr w:type="spellStart"/>
-            <w:r>
-              <w:rPr>
-                <w:rFonts w:cs="Arial"/>
-                <w:lang w:val="fr-FR"/>
-              </w:rPr>
-              <w:t>empresa</w:t>
-            </w:r>
-            <w:proofErr w:type="spellEnd"/>
-            <w:r>
-              <w:rPr>
-                <w:rFonts w:cs="Arial"/>
-                <w:lang w:val="fr-FR"/>
-              </w:rPr>
-              <w:t xml:space="preserve"> </w:t>
-            </w:r>
-            <w:proofErr w:type="spellStart"/>
-            <w:r>
-              <w:rPr>
-                <w:rFonts w:cs="Arial"/>
-                <w:lang w:val="fr-FR"/>
-              </w:rPr>
-              <w:t>suministradora</w:t>
-            </w:r>
-            <w:proofErr w:type="spellEnd"/>
+              <w:t>Por la empresa suministradora</w:t>
+            </w:r>
           </w:p>
         </w:tc>
       </w:tr>
@@ -1020,21 +981,7 @@
               <w:rPr>
                 <w:rFonts w:cs="Arial"/>
               </w:rPr>
-              <w:t xml:space="preserve">D./ </w:t>
-            </w:r>
-            <w:proofErr w:type="spellStart"/>
-            <w:r>
-              <w:rPr>
-                <w:rFonts w:cs="Arial"/>
-              </w:rPr>
-              <w:t>Dña</w:t>
-            </w:r>
-            <w:proofErr w:type="spellEnd"/>
-            <w:r>
-              <w:rPr>
-                <w:rFonts w:cs="Arial"/>
-              </w:rPr>
-              <w:t xml:space="preserve"> </w:t>
+              <w:t xml:space="preserve">D./ Dña </w:t>
             </w:r>
             <w:r>
               <w:fldChar w:fldCharType="begin"/>
@@ -1075,21 +1022,7 @@
               <w:rPr>
                 <w:rFonts w:cs="Arial"/>
               </w:rPr>
-              <w:t>Fdo. D./</w:t>
-            </w:r>
-            <w:proofErr w:type="spellStart"/>
-            <w:r>
-              <w:rPr>
-                <w:rFonts w:cs="Arial"/>
-              </w:rPr>
-              <w:t>Dña</w:t>
-            </w:r>
-            <w:proofErr w:type="spellEnd"/>
-            <w:r>
-              <w:rPr>
-                <w:rFonts w:cs="Arial"/>
-              </w:rPr>
-              <w:t xml:space="preserve"> </w:t>
+              <w:t xml:space="preserve">Fdo. D./Dña </w:t>
             </w:r>
             <w:r>
               <w:fldChar w:fldCharType="begin"/>
@@ -1178,7 +1111,11 @@
     <w:sdt>
       <w:sdtPr>
         <w:rPr>
-          <w:lang w:val="es-ES"/>
+          <w:rFonts w:ascii="Arial" w:eastAsia="Times New Roman" w:hAnsi="Arial" w:cs="Times New Roman"/>
+          <w:color w:val="auto"/>
+          <w:sz w:val="20"/>
+          <w:szCs w:val="24"/>
+          <w:lang w:val="es-ES" w:eastAsia="es-ES"/>
         </w:rPr>
         <w:id w:val="628589184"/>
         <w:docPartObj>
@@ -1188,13 +1125,8 @@
       </w:sdtPr>
       <w:sdtEndPr>
         <w:rPr>
-          <w:rFonts w:ascii="Arial" w:eastAsia="Times New Roman" w:hAnsi="Arial" w:cs="Times New Roman"/>
           <w:b/>
           <w:bCs/>
-          <w:color w:val="auto"/>
-          <w:sz w:val="20"/>
-          <w:szCs w:val="24"/>
-          <w:lang w:eastAsia="es-ES"/>
         </w:rPr>
       </w:sdtEndPr>
       <w:sdtContent>
@@ -1243,21 +1175,7 @@
                 <w:rStyle w:val="Hipervnculo"/>
                 <w:noProof/>
               </w:rPr>
-              <w:t>Ficha del do</w:t>
-            </w:r>
-            <w:r>
-              <w:rPr>
-                <w:rStyle w:val="Hipervnculo"/>
-                <w:noProof/>
-              </w:rPr>
-              <w:t>c</w:t>
-            </w:r>
-            <w:r>
-              <w:rPr>
-                <w:rStyle w:val="Hipervnculo"/>
-                <w:noProof/>
-              </w:rPr>
-              <w:t>umento</w:t>
+              <w:t>Ficha del documento</w:t>
             </w:r>
             <w:r>
               <w:rPr>
@@ -4971,21 +4889,13 @@
         <w:t xml:space="preserve">El propósito de este documento es especificar los requisitos de software para la </w:t>
       </w:r>
       <w:r>
-        <w:t>app (</w:t>
-      </w:r>
-      <w:proofErr w:type="gramStart"/>
-      <w:r>
-        <w:t xml:space="preserve">falta </w:t>
+        <w:t xml:space="preserve">app (falta </w:t>
       </w:r>
       <w:r>
         <w:t xml:space="preserve"> </w:t>
       </w:r>
       <w:r>
-        <w:t>el</w:t>
-      </w:r>
-      <w:proofErr w:type="gramEnd"/>
-      <w:r>
-        <w:t xml:space="preserve"> nombre de la app) </w:t>
+        <w:t xml:space="preserve">el nombre de la app) </w:t>
       </w:r>
       <w:r>
         <w:t>de</w:t>
@@ -5019,7 +4929,13 @@
         <w:pStyle w:val="Normalindentado2"/>
       </w:pPr>
       <w:r>
-        <w:t>Nombre del sistema: Pendiente.</w:t>
+        <w:t xml:space="preserve">Nombre del sistema: </w:t>
+      </w:r>
+      <w:r>
+        <w:t>AppDimex</w:t>
+      </w:r>
+      <w:r>
+        <w:t>.</w:t>
       </w:r>
     </w:p>
     <w:p>
@@ -6243,506 +6159,13 @@
       <w:pPr>
         <w:pStyle w:val="Ttulo2"/>
       </w:pPr>
-      <w:bookmarkStart w:id="16" w:name="_Toc33238237"/>
-      <w:bookmarkStart w:id="17" w:name="_Toc33411064"/>
-      <w:bookmarkStart w:id="18" w:name="_Toc235463702"/>
+      <w:bookmarkStart w:id="16" w:name="_Toc33411065"/>
+      <w:bookmarkStart w:id="17" w:name="_Toc235463703"/>
       <w:r>
-        <w:t>Referencias</w:t>
+        <w:t>Resumen</w:t>
       </w:r>
       <w:bookmarkEnd w:id="16"/>
       <w:bookmarkEnd w:id="17"/>
-      <w:bookmarkEnd w:id="18"/>
-    </w:p>
-    <w:tbl>
-      <w:tblPr>
-        <w:tblW w:w="0" w:type="auto"/>
-        <w:tblInd w:w="743" w:type="dxa"/>
-        <w:tblBorders>
-          <w:top w:val="single" w:sz="4" w:space="0" w:color="292929"/>
-          <w:left w:val="single" w:sz="4" w:space="0" w:color="292929"/>
-          <w:bottom w:val="single" w:sz="4" w:space="0" w:color="292929"/>
-          <w:right w:val="single" w:sz="4" w:space="0" w:color="292929"/>
-          <w:insideH w:val="single" w:sz="4" w:space="0" w:color="292929"/>
-          <w:insideV w:val="double" w:sz="6" w:space="0" w:color="292929"/>
-        </w:tblBorders>
-        <w:tblCellMar>
-          <w:left w:w="70" w:type="dxa"/>
-          <w:right w:w="70" w:type="dxa"/>
-        </w:tblCellMar>
-        <w:tblLook w:val="0000" w:firstRow="0" w:lastRow="0" w:firstColumn="0" w:lastColumn="0" w:noHBand="0" w:noVBand="0"/>
-      </w:tblPr>
-      <w:tblGrid>
-        <w:gridCol w:w="1252"/>
-        <w:gridCol w:w="1966"/>
-        <w:gridCol w:w="2142"/>
-        <w:gridCol w:w="862"/>
-        <w:gridCol w:w="1529"/>
-      </w:tblGrid>
-      <w:tr>
-        <w:trPr>
-          <w:cantSplit/>
-          <w:trHeight w:val="284"/>
-        </w:trPr>
-        <w:tc>
-          <w:tcPr>
-            <w:tcW w:w="1254" w:type="dxa"/>
-            <w:tcBorders>
-              <w:bottom w:val="double" w:sz="6" w:space="0" w:color="292929"/>
-            </w:tcBorders>
-            <w:shd w:val="clear" w:color="auto" w:fill="EAEAEA"/>
-            <w:tcMar>
-              <w:top w:w="17" w:type="dxa"/>
-              <w:left w:w="17" w:type="dxa"/>
-              <w:bottom w:w="17" w:type="dxa"/>
-              <w:right w:w="17" w:type="dxa"/>
-            </w:tcMar>
-            <w:vAlign w:val="bottom"/>
-          </w:tcPr>
-          <w:p>
-            <w:pPr>
-              <w:jc w:val="center"/>
-              <w:rPr>
-                <w:b/>
-                <w:bCs/>
-              </w:rPr>
-            </w:pPr>
-            <w:r>
-              <w:rPr>
-                <w:b/>
-                <w:bCs/>
-              </w:rPr>
-              <w:t>Referencia</w:t>
-            </w:r>
-          </w:p>
-        </w:tc>
-        <w:tc>
-          <w:tcPr>
-            <w:tcW w:w="1980" w:type="dxa"/>
-            <w:tcBorders>
-              <w:bottom w:val="double" w:sz="6" w:space="0" w:color="292929"/>
-              <w:right w:val="single" w:sz="4" w:space="0" w:color="292929"/>
-            </w:tcBorders>
-            <w:shd w:val="clear" w:color="auto" w:fill="EAEAEA"/>
-            <w:tcMar>
-              <w:top w:w="17" w:type="dxa"/>
-              <w:left w:w="17" w:type="dxa"/>
-              <w:bottom w:w="17" w:type="dxa"/>
-              <w:right w:w="17" w:type="dxa"/>
-            </w:tcMar>
-            <w:vAlign w:val="bottom"/>
-          </w:tcPr>
-          <w:p>
-            <w:pPr>
-              <w:jc w:val="center"/>
-              <w:rPr>
-                <w:b/>
-                <w:bCs/>
-              </w:rPr>
-            </w:pPr>
-            <w:r>
-              <w:rPr>
-                <w:b/>
-                <w:bCs/>
-              </w:rPr>
-              <w:t>Titulo</w:t>
-            </w:r>
-          </w:p>
-        </w:tc>
-        <w:tc>
-          <w:tcPr>
-            <w:tcW w:w="2160" w:type="dxa"/>
-            <w:tcBorders>
-              <w:left w:val="single" w:sz="4" w:space="0" w:color="292929"/>
-              <w:bottom w:val="double" w:sz="6" w:space="0" w:color="292929"/>
-              <w:right w:val="single" w:sz="4" w:space="0" w:color="292929"/>
-            </w:tcBorders>
-            <w:shd w:val="clear" w:color="auto" w:fill="EAEAEA"/>
-            <w:tcMar>
-              <w:top w:w="17" w:type="dxa"/>
-              <w:left w:w="17" w:type="dxa"/>
-              <w:bottom w:w="17" w:type="dxa"/>
-              <w:right w:w="17" w:type="dxa"/>
-            </w:tcMar>
-            <w:vAlign w:val="bottom"/>
-          </w:tcPr>
-          <w:p>
-            <w:pPr>
-              <w:jc w:val="center"/>
-              <w:rPr>
-                <w:b/>
-                <w:bCs/>
-              </w:rPr>
-            </w:pPr>
-            <w:r>
-              <w:rPr>
-                <w:b/>
-                <w:bCs/>
-              </w:rPr>
-              <w:t>Ruta</w:t>
-            </w:r>
-          </w:p>
-        </w:tc>
-        <w:tc>
-          <w:tcPr>
-            <w:tcW w:w="863" w:type="dxa"/>
-            <w:tcBorders>
-              <w:left w:val="single" w:sz="4" w:space="0" w:color="292929"/>
-              <w:bottom w:val="double" w:sz="6" w:space="0" w:color="292929"/>
-              <w:right w:val="single" w:sz="4" w:space="0" w:color="292929"/>
-            </w:tcBorders>
-            <w:shd w:val="clear" w:color="auto" w:fill="EAEAEA"/>
-            <w:tcMar>
-              <w:top w:w="17" w:type="dxa"/>
-              <w:left w:w="17" w:type="dxa"/>
-              <w:bottom w:w="17" w:type="dxa"/>
-              <w:right w:w="17" w:type="dxa"/>
-            </w:tcMar>
-            <w:vAlign w:val="bottom"/>
-          </w:tcPr>
-          <w:p>
-            <w:pPr>
-              <w:jc w:val="center"/>
-              <w:rPr>
-                <w:b/>
-                <w:bCs/>
-              </w:rPr>
-            </w:pPr>
-            <w:r>
-              <w:rPr>
-                <w:b/>
-                <w:bCs/>
-              </w:rPr>
-              <w:t>Fecha</w:t>
-            </w:r>
-          </w:p>
-        </w:tc>
-        <w:tc>
-          <w:tcPr>
-            <w:tcW w:w="1538" w:type="dxa"/>
-            <w:tcBorders>
-              <w:left w:val="single" w:sz="4" w:space="0" w:color="292929"/>
-              <w:bottom w:val="double" w:sz="6" w:space="0" w:color="292929"/>
-            </w:tcBorders>
-            <w:shd w:val="clear" w:color="auto" w:fill="EAEAEA"/>
-            <w:tcMar>
-              <w:top w:w="17" w:type="dxa"/>
-              <w:left w:w="17" w:type="dxa"/>
-              <w:bottom w:w="17" w:type="dxa"/>
-              <w:right w:w="17" w:type="dxa"/>
-            </w:tcMar>
-            <w:vAlign w:val="bottom"/>
-          </w:tcPr>
-          <w:p>
-            <w:pPr>
-              <w:jc w:val="center"/>
-              <w:rPr>
-                <w:b/>
-                <w:bCs/>
-              </w:rPr>
-            </w:pPr>
-            <w:r>
-              <w:rPr>
-                <w:b/>
-                <w:bCs/>
-              </w:rPr>
-              <w:t>Autor</w:t>
-            </w:r>
-          </w:p>
-        </w:tc>
-      </w:tr>
-      <w:tr>
-        <w:trPr>
-          <w:cantSplit/>
-        </w:trPr>
-        <w:tc>
-          <w:tcPr>
-            <w:tcW w:w="1254" w:type="dxa"/>
-            <w:tcBorders>
-              <w:top w:val="double" w:sz="6" w:space="0" w:color="292929"/>
-            </w:tcBorders>
-          </w:tcPr>
-          <w:p>
-            <w:pPr>
-              <w:pStyle w:val="Normalindentado2"/>
-              <w:ind w:left="0"/>
-            </w:pPr>
-            <w:r>
-              <w:fldChar w:fldCharType="begin"/>
-            </w:r>
-            <w:r>
-              <w:instrText>MACROBUTTON NoMacro [</w:instrText>
-            </w:r>
-            <w:r>
-              <w:rPr>
-                <w:color w:val="0000FF"/>
-              </w:rPr>
-              <w:instrText>Ref.</w:instrText>
-            </w:r>
-            <w:r>
-              <w:instrText>]</w:instrText>
-            </w:r>
-            <w:r>
-              <w:fldChar w:fldCharType="end"/>
-            </w:r>
-          </w:p>
-        </w:tc>
-        <w:tc>
-          <w:tcPr>
-            <w:tcW w:w="1980" w:type="dxa"/>
-            <w:tcBorders>
-              <w:top w:val="double" w:sz="6" w:space="0" w:color="292929"/>
-              <w:right w:val="single" w:sz="4" w:space="0" w:color="292929"/>
-            </w:tcBorders>
-          </w:tcPr>
-          <w:p>
-            <w:pPr>
-              <w:pStyle w:val="Normalindentado2"/>
-              <w:ind w:left="0"/>
-            </w:pPr>
-            <w:r>
-              <w:fldChar w:fldCharType="begin"/>
-            </w:r>
-            <w:r>
-              <w:instrText>MACROBUTTON NoMacro [</w:instrText>
-            </w:r>
-            <w:r>
-              <w:rPr>
-                <w:color w:val="0000FF"/>
-              </w:rPr>
-              <w:instrText>Título</w:instrText>
-            </w:r>
-            <w:r>
-              <w:instrText>]</w:instrText>
-            </w:r>
-            <w:r>
-              <w:fldChar w:fldCharType="end"/>
-            </w:r>
-          </w:p>
-        </w:tc>
-        <w:tc>
-          <w:tcPr>
-            <w:tcW w:w="2160" w:type="dxa"/>
-            <w:tcBorders>
-              <w:top w:val="double" w:sz="6" w:space="0" w:color="292929"/>
-              <w:left w:val="single" w:sz="4" w:space="0" w:color="292929"/>
-              <w:right w:val="single" w:sz="4" w:space="0" w:color="292929"/>
-            </w:tcBorders>
-            <w:tcMar>
-              <w:top w:w="17" w:type="dxa"/>
-              <w:left w:w="40" w:type="dxa"/>
-              <w:bottom w:w="0" w:type="dxa"/>
-              <w:right w:w="40" w:type="dxa"/>
-            </w:tcMar>
-          </w:tcPr>
-          <w:p>
-            <w:pPr>
-              <w:pStyle w:val="Normalindentado2"/>
-              <w:ind w:left="0"/>
-            </w:pPr>
-            <w:r>
-              <w:fldChar w:fldCharType="begin"/>
-            </w:r>
-            <w:r>
-              <w:instrText>MACROBUTTON NoMacro [</w:instrText>
-            </w:r>
-            <w:r>
-              <w:rPr>
-                <w:color w:val="0000FF"/>
-              </w:rPr>
-              <w:instrText>Ruta</w:instrText>
-            </w:r>
-            <w:r>
-              <w:instrText>]</w:instrText>
-            </w:r>
-            <w:r>
-              <w:fldChar w:fldCharType="end"/>
-            </w:r>
-          </w:p>
-        </w:tc>
-        <w:tc>
-          <w:tcPr>
-            <w:tcW w:w="863" w:type="dxa"/>
-            <w:tcBorders>
-              <w:top w:val="double" w:sz="6" w:space="0" w:color="292929"/>
-              <w:left w:val="single" w:sz="4" w:space="0" w:color="292929"/>
-              <w:right w:val="single" w:sz="4" w:space="0" w:color="292929"/>
-            </w:tcBorders>
-            <w:tcMar>
-              <w:bottom w:w="0" w:type="dxa"/>
-            </w:tcMar>
-          </w:tcPr>
-          <w:p>
-            <w:pPr>
-              <w:pStyle w:val="Normalindentado2"/>
-              <w:ind w:left="0"/>
-            </w:pPr>
-            <w:r>
-              <w:fldChar w:fldCharType="begin"/>
-            </w:r>
-            <w:r>
-              <w:instrText>MACROBUTTON NoMacro [</w:instrText>
-            </w:r>
-            <w:r>
-              <w:rPr>
-                <w:color w:val="0000FF"/>
-              </w:rPr>
-              <w:instrText>Fecha</w:instrText>
-            </w:r>
-            <w:r>
-              <w:instrText>]</w:instrText>
-            </w:r>
-            <w:r>
-              <w:fldChar w:fldCharType="end"/>
-            </w:r>
-          </w:p>
-        </w:tc>
-        <w:tc>
-          <w:tcPr>
-            <w:tcW w:w="1538" w:type="dxa"/>
-            <w:tcBorders>
-              <w:top w:val="double" w:sz="6" w:space="0" w:color="292929"/>
-              <w:left w:val="single" w:sz="4" w:space="0" w:color="292929"/>
-            </w:tcBorders>
-            <w:tcMar>
-              <w:bottom w:w="0" w:type="dxa"/>
-            </w:tcMar>
-          </w:tcPr>
-          <w:p>
-            <w:pPr>
-              <w:pStyle w:val="Normalindentado2"/>
-              <w:ind w:left="0"/>
-            </w:pPr>
-            <w:r>
-              <w:fldChar w:fldCharType="begin"/>
-            </w:r>
-            <w:r>
-              <w:instrText>MACROBUTTON NoMacro [</w:instrText>
-            </w:r>
-            <w:r>
-              <w:rPr>
-                <w:color w:val="0000FF"/>
-              </w:rPr>
-              <w:instrText>Autor</w:instrText>
-            </w:r>
-            <w:r>
-              <w:instrText>]</w:instrText>
-            </w:r>
-            <w:r>
-              <w:fldChar w:fldCharType="end"/>
-            </w:r>
-          </w:p>
-        </w:tc>
-      </w:tr>
-      <w:tr>
-        <w:trPr>
-          <w:cantSplit/>
-        </w:trPr>
-        <w:tc>
-          <w:tcPr>
-            <w:tcW w:w="1254" w:type="dxa"/>
-          </w:tcPr>
-          <w:p>
-            <w:pPr>
-              <w:pStyle w:val="Normalindentado2"/>
-              <w:ind w:left="0"/>
-            </w:pPr>
-          </w:p>
-        </w:tc>
-        <w:tc>
-          <w:tcPr>
-            <w:tcW w:w="1980" w:type="dxa"/>
-            <w:tcBorders>
-              <w:right w:val="single" w:sz="4" w:space="0" w:color="292929"/>
-            </w:tcBorders>
-          </w:tcPr>
-          <w:p>
-            <w:pPr>
-              <w:pStyle w:val="Normalindentado2"/>
-              <w:ind w:left="0"/>
-            </w:pPr>
-          </w:p>
-        </w:tc>
-        <w:tc>
-          <w:tcPr>
-            <w:tcW w:w="2160" w:type="dxa"/>
-            <w:tcBorders>
-              <w:left w:val="single" w:sz="4" w:space="0" w:color="292929"/>
-              <w:right w:val="single" w:sz="4" w:space="0" w:color="292929"/>
-            </w:tcBorders>
-            <w:tcMar>
-              <w:top w:w="17" w:type="dxa"/>
-              <w:left w:w="40" w:type="dxa"/>
-              <w:bottom w:w="0" w:type="dxa"/>
-              <w:right w:w="40" w:type="dxa"/>
-            </w:tcMar>
-          </w:tcPr>
-          <w:p>
-            <w:pPr>
-              <w:pStyle w:val="Normalindentado2"/>
-              <w:ind w:left="0"/>
-            </w:pPr>
-          </w:p>
-        </w:tc>
-        <w:tc>
-          <w:tcPr>
-            <w:tcW w:w="863" w:type="dxa"/>
-            <w:tcBorders>
-              <w:left w:val="single" w:sz="4" w:space="0" w:color="292929"/>
-              <w:right w:val="single" w:sz="4" w:space="0" w:color="292929"/>
-            </w:tcBorders>
-            <w:tcMar>
-              <w:bottom w:w="0" w:type="dxa"/>
-            </w:tcMar>
-          </w:tcPr>
-          <w:p>
-            <w:pPr>
-              <w:pStyle w:val="Normalindentado2"/>
-              <w:ind w:left="0"/>
-            </w:pPr>
-          </w:p>
-        </w:tc>
-        <w:tc>
-          <w:tcPr>
-            <w:tcW w:w="1538" w:type="dxa"/>
-            <w:tcBorders>
-              <w:left w:val="single" w:sz="4" w:space="0" w:color="292929"/>
-            </w:tcBorders>
-            <w:tcMar>
-              <w:bottom w:w="0" w:type="dxa"/>
-            </w:tcMar>
-          </w:tcPr>
-          <w:p>
-            <w:pPr>
-              <w:pStyle w:val="Normalindentado2"/>
-              <w:ind w:left="0"/>
-            </w:pPr>
-          </w:p>
-        </w:tc>
-      </w:tr>
-    </w:tbl>
-    <w:p>
-      <w:pPr>
-        <w:pStyle w:val="guiazul"/>
-        <w:ind w:left="708"/>
-      </w:pPr>
-    </w:p>
-    <w:p>
-      <w:pPr>
-        <w:pStyle w:val="guiazul"/>
-        <w:ind w:left="708"/>
-      </w:pPr>
-    </w:p>
-    <w:p>
-      <w:pPr>
-        <w:pStyle w:val="Ttulo2"/>
-      </w:pPr>
-      <w:bookmarkStart w:id="19" w:name="_Toc33411065"/>
-      <w:bookmarkStart w:id="20" w:name="_Toc235463703"/>
-      <w:r>
-        <w:t>Resumen</w:t>
-      </w:r>
-      <w:bookmarkEnd w:id="19"/>
-      <w:bookmarkEnd w:id="20"/>
     </w:p>
     <w:p>
       <w:pPr>
@@ -6769,11 +6192,25 @@
       <w:pPr>
         <w:pStyle w:val="Ttulo1"/>
       </w:pPr>
-      <w:bookmarkStart w:id="21" w:name="_Toc33238239"/>
-      <w:bookmarkStart w:id="22" w:name="_Toc33411066"/>
-      <w:bookmarkStart w:id="23" w:name="_Toc235463704"/>
+      <w:bookmarkStart w:id="18" w:name="_Toc33238239"/>
+      <w:bookmarkStart w:id="19" w:name="_Toc33411066"/>
+      <w:bookmarkStart w:id="20" w:name="_Toc235463704"/>
       <w:r>
         <w:t>Descripción general</w:t>
+      </w:r>
+      <w:bookmarkEnd w:id="18"/>
+      <w:bookmarkEnd w:id="19"/>
+      <w:bookmarkEnd w:id="20"/>
+    </w:p>
+    <w:p>
+      <w:pPr>
+        <w:pStyle w:val="Ttulo2"/>
+      </w:pPr>
+      <w:bookmarkStart w:id="21" w:name="_Toc33238240"/>
+      <w:bookmarkStart w:id="22" w:name="_Toc33411067"/>
+      <w:bookmarkStart w:id="23" w:name="_Toc235463705"/>
+      <w:r>
+        <w:t>Perspectiva del producto</w:t>
       </w:r>
       <w:bookmarkEnd w:id="21"/>
       <w:bookmarkEnd w:id="22"/>
@@ -6781,41 +6218,27 @@
     </w:p>
     <w:p>
       <w:pPr>
+        <w:pStyle w:val="Normalindentado2"/>
+      </w:pPr>
+      <w:r>
+        <w:t>El software es una aplicación móvil independiente en su interfaz, pero conectada directamente como cliente del Sistema Central de Dimex y del Servidor de Parámetros Financieros para la consulta de tasas e historial en tiempo real.</w:t>
+      </w:r>
+    </w:p>
+    <w:p>
+      <w:pPr>
         <w:pStyle w:val="Ttulo2"/>
       </w:pPr>
-      <w:bookmarkStart w:id="24" w:name="_Toc33238240"/>
-      <w:bookmarkStart w:id="25" w:name="_Toc33411067"/>
-      <w:bookmarkStart w:id="26" w:name="_Toc235463705"/>
+      <w:bookmarkStart w:id="24" w:name="_Toc532878319"/>
+      <w:bookmarkStart w:id="25" w:name="_Toc33238241"/>
+      <w:bookmarkStart w:id="26" w:name="_Toc33411068"/>
+      <w:bookmarkStart w:id="27" w:name="_Toc235463706"/>
       <w:r>
-        <w:t>Perspectiva del producto</w:t>
+        <w:t>Funcionalidad del producto</w:t>
       </w:r>
       <w:bookmarkEnd w:id="24"/>
       <w:bookmarkEnd w:id="25"/>
       <w:bookmarkEnd w:id="26"/>
-    </w:p>
-    <w:p>
-      <w:pPr>
-        <w:pStyle w:val="Normalindentado2"/>
-      </w:pPr>
-      <w:r>
-        <w:t>El software es una aplicación móvil independiente en su interfaz, pero conectada directamente como cliente del Sistema Central de Dimex y del Servidor de Parámetros Financieros para la consulta de tasas e historial en tiempo real.</w:t>
-      </w:r>
-    </w:p>
-    <w:p>
-      <w:pPr>
-        <w:pStyle w:val="Ttulo2"/>
-      </w:pPr>
-      <w:bookmarkStart w:id="27" w:name="_Toc532878319"/>
-      <w:bookmarkStart w:id="28" w:name="_Toc33238241"/>
-      <w:bookmarkStart w:id="29" w:name="_Toc33411068"/>
-      <w:bookmarkStart w:id="30" w:name="_Toc235463706"/>
-      <w:r>
-        <w:t>Funcionalidad del producto</w:t>
-      </w:r>
       <w:bookmarkEnd w:id="27"/>
-      <w:bookmarkEnd w:id="28"/>
-      <w:bookmarkEnd w:id="29"/>
-      <w:bookmarkEnd w:id="30"/>
     </w:p>
     <w:p>
       <w:pPr>
@@ -6970,38 +6393,19 @@
     </w:p>
     <w:p>
       <w:pPr>
-        <w:pStyle w:val="guiazul"/>
-        <w:ind w:left="600"/>
-      </w:pPr>
-    </w:p>
-    <w:p>
-      <w:pPr>
-        <w:pStyle w:val="guiazul"/>
-        <w:ind w:left="600"/>
-      </w:pPr>
-    </w:p>
-    <w:p>
-      <w:pPr>
-        <w:pStyle w:val="guiazul"/>
-        <w:ind w:left="600"/>
-      </w:pPr>
-    </w:p>
-    <w:p>
-      <w:pPr>
         <w:pStyle w:val="Ttulo2"/>
       </w:pPr>
-      <w:bookmarkStart w:id="31" w:name="_Toc532878320"/>
-      <w:bookmarkStart w:id="32" w:name="_Toc33238242"/>
-      <w:bookmarkStart w:id="33" w:name="_Toc33411069"/>
-      <w:bookmarkStart w:id="34" w:name="_Toc235463707"/>
+      <w:bookmarkStart w:id="28" w:name="_Toc532878320"/>
+      <w:bookmarkStart w:id="29" w:name="_Toc33238242"/>
+      <w:bookmarkStart w:id="30" w:name="_Toc33411069"/>
+      <w:bookmarkStart w:id="31" w:name="_Toc235463707"/>
       <w:r>
-        <w:lastRenderedPageBreak/>
         <w:t>Características de los usuarios</w:t>
       </w:r>
+      <w:bookmarkEnd w:id="28"/>
+      <w:bookmarkEnd w:id="29"/>
+      <w:bookmarkEnd w:id="30"/>
       <w:bookmarkEnd w:id="31"/>
-      <w:bookmarkEnd w:id="32"/>
-      <w:bookmarkEnd w:id="33"/>
-      <w:bookmarkEnd w:id="34"/>
     </w:p>
     <w:tbl>
       <w:tblPr>
@@ -7242,15 +6646,7 @@
               <w:ind w:left="0"/>
             </w:pPr>
             <w:r>
-              <w:t xml:space="preserve">Abordaje en vía pública, captura de datos, cotización y envío de </w:t>
-            </w:r>
-            <w:proofErr w:type="spellStart"/>
-            <w:r>
-              <w:t>pre-evaluación</w:t>
-            </w:r>
-            <w:proofErr w:type="spellEnd"/>
-            <w:r>
-              <w:t xml:space="preserve"> al corporativo</w:t>
+              <w:t>Abordaje en vía pública, captura de datos, cotización y envío de pre-evaluación al corporativo</w:t>
             </w:r>
           </w:p>
         </w:tc>
@@ -7266,17 +6662,18 @@
       <w:pPr>
         <w:pStyle w:val="Ttulo2"/>
       </w:pPr>
-      <w:bookmarkStart w:id="35" w:name="_Toc532878321"/>
-      <w:bookmarkStart w:id="36" w:name="_Toc33238243"/>
-      <w:bookmarkStart w:id="37" w:name="_Toc33411070"/>
-      <w:bookmarkStart w:id="38" w:name="_Toc235463708"/>
+      <w:bookmarkStart w:id="32" w:name="_Toc532878321"/>
+      <w:bookmarkStart w:id="33" w:name="_Toc33238243"/>
+      <w:bookmarkStart w:id="34" w:name="_Toc33411070"/>
+      <w:bookmarkStart w:id="35" w:name="_Toc235463708"/>
       <w:r>
+        <w:lastRenderedPageBreak/>
         <w:t>Restricciones</w:t>
       </w:r>
+      <w:bookmarkEnd w:id="32"/>
+      <w:bookmarkEnd w:id="33"/>
+      <w:bookmarkEnd w:id="34"/>
       <w:bookmarkEnd w:id="35"/>
-      <w:bookmarkEnd w:id="36"/>
-      <w:bookmarkEnd w:id="37"/>
-      <w:bookmarkEnd w:id="38"/>
     </w:p>
     <w:p>
       <w:pPr>
@@ -7304,15 +6701,7 @@
         </w:numPr>
       </w:pPr>
       <w:r>
-        <w:t>Restricción de Plataforma: Debe funcionar exclusivamente en dispositivos móviles (smartphones/</w:t>
-      </w:r>
-      <w:proofErr w:type="spellStart"/>
-      <w:r>
-        <w:t>tablets</w:t>
-      </w:r>
-      <w:proofErr w:type="spellEnd"/>
-      <w:r>
-        <w:t>).</w:t>
+        <w:t>Restricción de Plataforma: Debe funcionar exclusivamente en dispositivos móviles (smartphones/tablets).</w:t>
       </w:r>
     </w:p>
     <w:p>
@@ -7339,17 +6728,17 @@
       <w:pPr>
         <w:pStyle w:val="Ttulo2"/>
       </w:pPr>
-      <w:bookmarkStart w:id="39" w:name="_Toc532878322"/>
-      <w:bookmarkStart w:id="40" w:name="_Toc33238244"/>
-      <w:bookmarkStart w:id="41" w:name="_Toc33411071"/>
-      <w:bookmarkStart w:id="42" w:name="_Toc235463709"/>
+      <w:bookmarkStart w:id="36" w:name="_Toc532878322"/>
+      <w:bookmarkStart w:id="37" w:name="_Toc33238244"/>
+      <w:bookmarkStart w:id="38" w:name="_Toc33411071"/>
+      <w:bookmarkStart w:id="39" w:name="_Toc235463709"/>
       <w:r>
         <w:t>Suposiciones y dependencias</w:t>
       </w:r>
+      <w:bookmarkEnd w:id="36"/>
+      <w:bookmarkEnd w:id="37"/>
+      <w:bookmarkEnd w:id="38"/>
       <w:bookmarkEnd w:id="39"/>
-      <w:bookmarkEnd w:id="40"/>
-      <w:bookmarkEnd w:id="41"/>
-      <w:bookmarkEnd w:id="42"/>
     </w:p>
     <w:p>
       <w:pPr>
@@ -7360,15 +6749,7 @@
         </w:numPr>
       </w:pPr>
       <w:r>
-        <w:t xml:space="preserve">Conectividad: Se asume cobertura de red móvil (3G/4G/5G) o </w:t>
-      </w:r>
-      <w:proofErr w:type="spellStart"/>
-      <w:r>
-        <w:t>Wi</w:t>
-      </w:r>
-      <w:proofErr w:type="spellEnd"/>
-      <w:r>
-        <w:t>-Fi para consultar las bases de datos corporativas.</w:t>
+        <w:t>Conectividad: Se asume cobertura de red móvil (3G/4G/5G) o Wi-Fi para consultar las bases de datos corporativas.</w:t>
       </w:r>
     </w:p>
     <w:p>
@@ -7388,15 +6769,7 @@
         </w:rPr>
       </w:pPr>
       <w:r>
-        <w:t xml:space="preserve">Disponibilidad del Servidor Central: El </w:t>
-      </w:r>
-      <w:proofErr w:type="spellStart"/>
-      <w:r>
-        <w:t>core</w:t>
-      </w:r>
-      <w:proofErr w:type="spellEnd"/>
-      <w:r>
-        <w:t xml:space="preserve"> de Dimex debe responder a las consultas de morosidad e historial sin caerse.</w:t>
+        <w:t>Disponibilidad del Servidor Central: El core de Dimex debe responder a las consultas de morosidad e historial sin caerse.</w:t>
       </w:r>
     </w:p>
     <w:p>
@@ -7413,17 +6786,17 @@
       <w:pPr>
         <w:pStyle w:val="Ttulo2"/>
       </w:pPr>
-      <w:bookmarkStart w:id="43" w:name="_Toc532878323"/>
-      <w:bookmarkStart w:id="44" w:name="_Toc33238245"/>
-      <w:bookmarkStart w:id="45" w:name="_Toc33411072"/>
-      <w:bookmarkStart w:id="46" w:name="_Toc235463710"/>
+      <w:bookmarkStart w:id="40" w:name="_Toc532878323"/>
+      <w:bookmarkStart w:id="41" w:name="_Toc33238245"/>
+      <w:bookmarkStart w:id="42" w:name="_Toc33411072"/>
+      <w:bookmarkStart w:id="43" w:name="_Toc235463710"/>
       <w:r>
         <w:t>Evolución previsible del sistema</w:t>
       </w:r>
+      <w:bookmarkEnd w:id="40"/>
+      <w:bookmarkEnd w:id="41"/>
+      <w:bookmarkEnd w:id="42"/>
       <w:bookmarkEnd w:id="43"/>
-      <w:bookmarkEnd w:id="44"/>
-      <w:bookmarkEnd w:id="45"/>
-      <w:bookmarkEnd w:id="46"/>
     </w:p>
     <w:p>
       <w:pPr>
@@ -7453,62 +6826,89 @@
           <w:lang w:val="es-MX"/>
         </w:rPr>
       </w:pPr>
-      <w:proofErr w:type="spellStart"/>
       <w:r>
-        <w:t>Pre-validación</w:t>
+        <w:t>Pre-validación biométrica mediante la cámara del celular para corregir errores antes de ir a sucursal.</w:t>
       </w:r>
-      <w:proofErr w:type="spellEnd"/>
-      <w:r>
-        <w:t xml:space="preserve"> biométrica mediante la cámara del celular para corregir errores antes de ir a sucursal.</w:t>
-      </w:r>
+    </w:p>
+    <w:p>
+      <w:pPr>
+        <w:pStyle w:val="Normalindentado2"/>
+        <w:ind w:left="1320"/>
+        <w:rPr>
+          <w:lang w:val="es-MX"/>
+        </w:rPr>
+      </w:pPr>
+    </w:p>
+    <w:p>
+      <w:pPr>
+        <w:pStyle w:val="Normalindentado2"/>
+        <w:ind w:left="1320"/>
+        <w:rPr>
+          <w:lang w:val="es-MX"/>
+        </w:rPr>
+      </w:pPr>
+    </w:p>
+    <w:p>
+      <w:pPr>
+        <w:pStyle w:val="Normalindentado2"/>
+        <w:ind w:left="1320"/>
+        <w:rPr>
+          <w:lang w:val="es-MX"/>
+        </w:rPr>
+      </w:pPr>
     </w:p>
     <w:p>
       <w:pPr>
         <w:pStyle w:val="Ttulo1"/>
       </w:pPr>
-      <w:bookmarkStart w:id="47" w:name="_Toc532878324"/>
-      <w:bookmarkStart w:id="48" w:name="_Toc33238246"/>
-      <w:bookmarkStart w:id="49" w:name="_Toc33411073"/>
-      <w:bookmarkStart w:id="50" w:name="_Toc235463711"/>
+      <w:bookmarkStart w:id="44" w:name="_Toc532878324"/>
+      <w:bookmarkStart w:id="45" w:name="_Toc33238246"/>
+      <w:bookmarkStart w:id="46" w:name="_Toc33411073"/>
+      <w:bookmarkStart w:id="47" w:name="_Toc235463711"/>
       <w:r>
         <w:t>Requisitos específicos</w:t>
       </w:r>
+      <w:bookmarkEnd w:id="44"/>
+      <w:bookmarkEnd w:id="45"/>
+      <w:bookmarkEnd w:id="46"/>
       <w:bookmarkEnd w:id="47"/>
-      <w:bookmarkEnd w:id="48"/>
-      <w:bookmarkEnd w:id="49"/>
-      <w:bookmarkEnd w:id="50"/>
+    </w:p>
+    <w:p>
+      <w:pPr>
+        <w:pStyle w:val="Normalindentado1"/>
+      </w:pPr>
     </w:p>
     <w:p>
       <w:pPr>
         <w:pStyle w:val="Ttulo2"/>
       </w:pPr>
-      <w:bookmarkStart w:id="51" w:name="_Toc33411074"/>
-      <w:bookmarkStart w:id="52" w:name="_Toc235463712"/>
+      <w:bookmarkStart w:id="48" w:name="_Toc33411074"/>
+      <w:bookmarkStart w:id="49" w:name="_Toc235463712"/>
       <w:r>
         <w:t>Requisitos comunes de los interfaces</w:t>
       </w:r>
-      <w:bookmarkEnd w:id="51"/>
-      <w:bookmarkEnd w:id="52"/>
+      <w:bookmarkEnd w:id="48"/>
+      <w:bookmarkEnd w:id="49"/>
     </w:p>
     <w:p>
       <w:pPr>
         <w:pStyle w:val="Ttulo3"/>
       </w:pPr>
-      <w:bookmarkStart w:id="53" w:name="_Toc33238248"/>
-      <w:bookmarkStart w:id="54" w:name="_Toc33411075"/>
-      <w:bookmarkStart w:id="55" w:name="_Toc235463713"/>
+      <w:bookmarkStart w:id="50" w:name="_Toc33238248"/>
+      <w:bookmarkStart w:id="51" w:name="_Toc33411075"/>
+      <w:bookmarkStart w:id="52" w:name="_Toc235463713"/>
       <w:r>
         <w:t>Interfaces de usuario</w:t>
       </w:r>
-      <w:bookmarkEnd w:id="53"/>
-      <w:bookmarkEnd w:id="54"/>
-      <w:bookmarkEnd w:id="55"/>
+      <w:bookmarkEnd w:id="50"/>
+      <w:bookmarkEnd w:id="51"/>
+      <w:bookmarkEnd w:id="52"/>
     </w:p>
     <w:p>
       <w:pPr>
         <w:pStyle w:val="Normalindentado2"/>
       </w:pPr>
-      <w:bookmarkStart w:id="56" w:name="_Toc33411076"/>
+      <w:bookmarkStart w:id="53" w:name="_Toc33411076"/>
       <w:r>
         <w:t>Interfaz móvil optimizada con botones de gran tamaño, tipografía clara y flujos paso a paso para agilizar la captura frente al cliente en vía pública.</w:t>
       </w:r>
@@ -7517,27 +6917,19 @@
       <w:pPr>
         <w:pStyle w:val="Ttulo3"/>
       </w:pPr>
-      <w:bookmarkStart w:id="57" w:name="_Toc235463714"/>
+      <w:bookmarkStart w:id="54" w:name="_Toc235463714"/>
       <w:r>
         <w:t>Interfaces de hardware</w:t>
       </w:r>
-      <w:bookmarkEnd w:id="56"/>
-      <w:bookmarkEnd w:id="57"/>
+      <w:bookmarkEnd w:id="53"/>
+      <w:bookmarkEnd w:id="54"/>
     </w:p>
     <w:p>
       <w:pPr>
         <w:pStyle w:val="Normalindentado3"/>
       </w:pPr>
       <w:r>
-        <w:t xml:space="preserve">Dispositivos móviles Android / iOS con pantalla táctil y conexión a Internet (datos móviles o </w:t>
-      </w:r>
-      <w:proofErr w:type="spellStart"/>
-      <w:r>
-        <w:t>Wi</w:t>
-      </w:r>
-      <w:proofErr w:type="spellEnd"/>
-      <w:r>
-        <w:t>-Fi).</w:t>
+        <w:t>Dispositivos móviles Android / iOS con pantalla táctil y conexión a Internet (datos móviles o Wi-Fi).</w:t>
       </w:r>
     </w:p>
     <w:p>
@@ -7552,16 +6944,16 @@
           <w:lang w:val="fr-FR"/>
         </w:rPr>
       </w:pPr>
-      <w:bookmarkStart w:id="58" w:name="_Toc33411077"/>
-      <w:bookmarkStart w:id="59" w:name="_Toc235463715"/>
+      <w:bookmarkStart w:id="55" w:name="_Toc33411077"/>
+      <w:bookmarkStart w:id="56" w:name="_Toc235463715"/>
       <w:r>
         <w:rPr>
           <w:lang w:val="fr-FR"/>
         </w:rPr>
         <w:t>Interfaces de software</w:t>
       </w:r>
-      <w:bookmarkEnd w:id="58"/>
-      <w:bookmarkEnd w:id="59"/>
+      <w:bookmarkEnd w:id="55"/>
+      <w:bookmarkEnd w:id="56"/>
     </w:p>
     <w:p>
       <w:pPr>
@@ -7600,16 +6992,16 @@
       <w:pPr>
         <w:pStyle w:val="Ttulo2"/>
       </w:pPr>
-      <w:bookmarkStart w:id="60" w:name="_Toc33238252"/>
-      <w:bookmarkStart w:id="61" w:name="_Toc33411079"/>
-      <w:bookmarkStart w:id="62" w:name="_Toc235463716"/>
+      <w:bookmarkStart w:id="57" w:name="_Toc33238252"/>
+      <w:bookmarkStart w:id="58" w:name="_Toc33411079"/>
+      <w:bookmarkStart w:id="59" w:name="_Toc235463716"/>
       <w:r>
         <w:lastRenderedPageBreak/>
         <w:t>Requisitos funcionales</w:t>
       </w:r>
-      <w:bookmarkEnd w:id="60"/>
-      <w:bookmarkEnd w:id="61"/>
-      <w:bookmarkEnd w:id="62"/>
+      <w:bookmarkEnd w:id="57"/>
+      <w:bookmarkEnd w:id="58"/>
+      <w:bookmarkEnd w:id="59"/>
       <w:r>
         <w:t xml:space="preserve"> </w:t>
       </w:r>
@@ -7618,18 +7010,18 @@
       <w:pPr>
         <w:pStyle w:val="Ttulo3"/>
       </w:pPr>
-      <w:bookmarkStart w:id="63" w:name="_Toc33238253"/>
-      <w:bookmarkStart w:id="64" w:name="_Toc33411080"/>
-      <w:bookmarkStart w:id="65" w:name="_Toc235463717"/>
+      <w:bookmarkStart w:id="60" w:name="_Toc33238253"/>
+      <w:bookmarkStart w:id="61" w:name="_Toc33411080"/>
+      <w:bookmarkStart w:id="62" w:name="_Toc235463717"/>
       <w:r>
         <w:t>Requisito</w:t>
       </w:r>
       <w:r>
         <w:t xml:space="preserve"> funcional 1</w:t>
       </w:r>
-      <w:bookmarkEnd w:id="63"/>
-      <w:bookmarkEnd w:id="64"/>
-      <w:bookmarkEnd w:id="65"/>
+      <w:bookmarkEnd w:id="60"/>
+      <w:bookmarkEnd w:id="61"/>
+      <w:bookmarkEnd w:id="62"/>
     </w:p>
     <w:tbl>
       <w:tblPr>
@@ -7971,7 +7363,7 @@
       </w:tr>
     </w:tbl>
     <w:p>
-      <w:bookmarkStart w:id="66" w:name="_Toc33411081"/>
+      <w:bookmarkStart w:id="63" w:name="_Toc33411081"/>
     </w:p>
     <w:p>
       <w:r>
@@ -7993,12 +7385,12 @@
       <w:pPr>
         <w:pStyle w:val="Ttulo3"/>
       </w:pPr>
-      <w:bookmarkStart w:id="67" w:name="_Toc235463718"/>
+      <w:bookmarkStart w:id="64" w:name="_Toc235463718"/>
       <w:r>
         <w:t>Requisito funcional 2</w:t>
       </w:r>
-      <w:bookmarkEnd w:id="66"/>
-      <w:bookmarkEnd w:id="67"/>
+      <w:bookmarkEnd w:id="63"/>
+      <w:bookmarkEnd w:id="64"/>
     </w:p>
     <w:tbl>
       <w:tblPr>
@@ -8457,7 +7849,7 @@
           <w:lang w:val="es-MX"/>
         </w:rPr>
       </w:pPr>
-      <w:bookmarkStart w:id="68" w:name="_Toc235463719"/>
+      <w:bookmarkStart w:id="65" w:name="_Toc235463719"/>
       <w:r>
         <w:rPr>
           <w:lang w:val="es-MX"/>
@@ -8465,7 +7857,7 @@
         <w:lastRenderedPageBreak/>
         <w:t>Requisito funcional 3</w:t>
       </w:r>
-      <w:bookmarkEnd w:id="68"/>
+      <w:bookmarkEnd w:id="65"/>
     </w:p>
     <w:tbl>
       <w:tblPr>
@@ -8883,7 +8275,7 @@
           <w:lang w:val="es-MX"/>
         </w:rPr>
       </w:pPr>
-      <w:bookmarkStart w:id="69" w:name="_Toc235463720"/>
+      <w:bookmarkStart w:id="66" w:name="_Toc235463720"/>
       <w:r>
         <w:rPr>
           <w:lang w:val="es-MX"/>
@@ -8896,7 +8288,7 @@
         </w:rPr>
         <w:t>4</w:t>
       </w:r>
-      <w:bookmarkEnd w:id="69"/>
+      <w:bookmarkEnd w:id="66"/>
     </w:p>
     <w:tbl>
       <w:tblPr>
@@ -9388,7 +8780,7 @@
           <w:lang w:val="es-MX"/>
         </w:rPr>
       </w:pPr>
-      <w:bookmarkStart w:id="70" w:name="_Toc235463721"/>
+      <w:bookmarkStart w:id="67" w:name="_Toc235463721"/>
       <w:r>
         <w:rPr>
           <w:lang w:val="es-MX"/>
@@ -9402,7 +8794,7 @@
         </w:rPr>
         <w:t>5</w:t>
       </w:r>
-      <w:bookmarkEnd w:id="70"/>
+      <w:bookmarkEnd w:id="67"/>
     </w:p>
     <w:tbl>
       <w:tblPr>
@@ -9823,7 +9215,7 @@
           <w:lang w:val="es-MX"/>
         </w:rPr>
       </w:pPr>
-      <w:bookmarkStart w:id="71" w:name="_Toc235463722"/>
+      <w:bookmarkStart w:id="68" w:name="_Toc235463722"/>
       <w:r>
         <w:rPr>
           <w:lang w:val="es-MX"/>
@@ -9836,7 +9228,7 @@
         </w:rPr>
         <w:t>6</w:t>
       </w:r>
-      <w:bookmarkEnd w:id="71"/>
+      <w:bookmarkEnd w:id="68"/>
     </w:p>
     <w:tbl>
       <w:tblPr>
@@ -10328,7 +9720,7 @@
           <w:lang w:val="es-MX"/>
         </w:rPr>
       </w:pPr>
-      <w:bookmarkStart w:id="72" w:name="_Toc235463723"/>
+      <w:bookmarkStart w:id="69" w:name="_Toc235463723"/>
       <w:r>
         <w:rPr>
           <w:lang w:val="es-MX"/>
@@ -10342,7 +9734,7 @@
         </w:rPr>
         <w:t>7</w:t>
       </w:r>
-      <w:bookmarkEnd w:id="72"/>
+      <w:bookmarkEnd w:id="69"/>
     </w:p>
     <w:tbl>
       <w:tblPr>
@@ -10752,29 +10144,29 @@
       <w:pPr>
         <w:pStyle w:val="Ttulo2"/>
       </w:pPr>
-      <w:bookmarkStart w:id="73" w:name="_Toc33238257"/>
-      <w:bookmarkStart w:id="74" w:name="_Toc33411084"/>
-      <w:bookmarkStart w:id="75" w:name="_Toc235463724"/>
+      <w:bookmarkStart w:id="70" w:name="_Toc33238257"/>
+      <w:bookmarkStart w:id="71" w:name="_Toc33411084"/>
+      <w:bookmarkStart w:id="72" w:name="_Toc235463724"/>
       <w:r>
         <w:t>Requisitos no funcionales</w:t>
+      </w:r>
+      <w:bookmarkEnd w:id="70"/>
+      <w:bookmarkEnd w:id="71"/>
+      <w:bookmarkEnd w:id="72"/>
+    </w:p>
+    <w:p>
+      <w:pPr>
+        <w:pStyle w:val="Ttulo3"/>
+      </w:pPr>
+      <w:bookmarkStart w:id="73" w:name="_Toc33238258"/>
+      <w:bookmarkStart w:id="74" w:name="_Toc33411085"/>
+      <w:bookmarkStart w:id="75" w:name="_Toc235463725"/>
+      <w:r>
+        <w:t>Requisitos de rendimiento</w:t>
       </w:r>
       <w:bookmarkEnd w:id="73"/>
       <w:bookmarkEnd w:id="74"/>
       <w:bookmarkEnd w:id="75"/>
-    </w:p>
-    <w:p>
-      <w:pPr>
-        <w:pStyle w:val="Ttulo3"/>
-      </w:pPr>
-      <w:bookmarkStart w:id="76" w:name="_Toc33238258"/>
-      <w:bookmarkStart w:id="77" w:name="_Toc33411085"/>
-      <w:bookmarkStart w:id="78" w:name="_Toc235463725"/>
-      <w:r>
-        <w:t>Requisitos de rendimiento</w:t>
-      </w:r>
-      <w:bookmarkEnd w:id="76"/>
-      <w:bookmarkEnd w:id="77"/>
-      <w:bookmarkEnd w:id="78"/>
     </w:p>
     <w:p>
       <w:pPr>
@@ -10791,15 +10183,15 @@
       <w:pPr>
         <w:pStyle w:val="Ttulo3"/>
       </w:pPr>
-      <w:bookmarkStart w:id="79" w:name="_Toc33238259"/>
-      <w:bookmarkStart w:id="80" w:name="_Toc33411086"/>
-      <w:bookmarkStart w:id="81" w:name="_Toc235463726"/>
+      <w:bookmarkStart w:id="76" w:name="_Toc33238259"/>
+      <w:bookmarkStart w:id="77" w:name="_Toc33411086"/>
+      <w:bookmarkStart w:id="78" w:name="_Toc235463726"/>
       <w:r>
         <w:t>Seguridad</w:t>
       </w:r>
-      <w:bookmarkEnd w:id="79"/>
-      <w:bookmarkEnd w:id="80"/>
-      <w:bookmarkEnd w:id="81"/>
+      <w:bookmarkEnd w:id="76"/>
+      <w:bookmarkEnd w:id="77"/>
+      <w:bookmarkEnd w:id="78"/>
     </w:p>
     <w:p>
       <w:pPr>
@@ -10810,10 +10202,7 @@
         </w:numPr>
       </w:pPr>
       <w:r>
-        <w:t>A</w:t>
-      </w:r>
-      <w:r>
-        <w:t>utenticación obligatoria de promotores.</w:t>
+        <w:t>Autenticación obligatoria de promotores.</w:t>
       </w:r>
     </w:p>
     <w:p>
@@ -10837,37 +10226,37 @@
       <w:pPr>
         <w:pStyle w:val="Ttulo3"/>
       </w:pPr>
-      <w:bookmarkStart w:id="82" w:name="_Toc33238260"/>
-      <w:bookmarkStart w:id="83" w:name="_Toc33411087"/>
-      <w:bookmarkStart w:id="84" w:name="_Toc235463727"/>
+      <w:bookmarkStart w:id="79" w:name="_Toc33238260"/>
+      <w:bookmarkStart w:id="80" w:name="_Toc33411087"/>
+      <w:bookmarkStart w:id="81" w:name="_Toc235463727"/>
       <w:r>
         <w:t>Fiabilidad</w:t>
+      </w:r>
+      <w:bookmarkEnd w:id="79"/>
+      <w:bookmarkEnd w:id="80"/>
+      <w:bookmarkEnd w:id="81"/>
+    </w:p>
+    <w:p>
+      <w:pPr>
+        <w:pStyle w:val="Normalindentado3"/>
+      </w:pPr>
+      <w:r>
+        <w:t>Precisión del 100% en los cálculos matemáticos de las tablas de amortización y corrida financiera según la tasa asignada.</w:t>
+      </w:r>
+    </w:p>
+    <w:p>
+      <w:pPr>
+        <w:pStyle w:val="Ttulo3"/>
+      </w:pPr>
+      <w:bookmarkStart w:id="82" w:name="_Toc33238261"/>
+      <w:bookmarkStart w:id="83" w:name="_Toc33411088"/>
+      <w:bookmarkStart w:id="84" w:name="_Toc235463728"/>
+      <w:r>
+        <w:t>Disponibilidad</w:t>
       </w:r>
       <w:bookmarkEnd w:id="82"/>
       <w:bookmarkEnd w:id="83"/>
       <w:bookmarkEnd w:id="84"/>
-    </w:p>
-    <w:p>
-      <w:pPr>
-        <w:pStyle w:val="Normalindentado3"/>
-      </w:pPr>
-      <w:r>
-        <w:t>Precisión del 100% en los cálculos matemáticos de las tablas de amortización y corrida financiera según la tasa asignada.</w:t>
-      </w:r>
-    </w:p>
-    <w:p>
-      <w:pPr>
-        <w:pStyle w:val="Ttulo3"/>
-      </w:pPr>
-      <w:bookmarkStart w:id="85" w:name="_Toc33238261"/>
-      <w:bookmarkStart w:id="86" w:name="_Toc33411088"/>
-      <w:bookmarkStart w:id="87" w:name="_Toc235463728"/>
-      <w:r>
-        <w:t>Disponibilidad</w:t>
-      </w:r>
-      <w:bookmarkEnd w:id="85"/>
-      <w:bookmarkEnd w:id="86"/>
-      <w:bookmarkEnd w:id="87"/>
     </w:p>
     <w:p>
       <w:pPr>
@@ -10886,37 +10275,37 @@
       <w:pPr>
         <w:pStyle w:val="Ttulo3"/>
       </w:pPr>
-      <w:bookmarkStart w:id="88" w:name="_Toc33238262"/>
-      <w:bookmarkStart w:id="89" w:name="_Toc33411089"/>
-      <w:bookmarkStart w:id="90" w:name="_Toc235463729"/>
+      <w:bookmarkStart w:id="85" w:name="_Toc33238262"/>
+      <w:bookmarkStart w:id="86" w:name="_Toc33411089"/>
+      <w:bookmarkStart w:id="87" w:name="_Toc235463729"/>
       <w:r>
         <w:t>Mantenibilidad</w:t>
+      </w:r>
+      <w:bookmarkEnd w:id="85"/>
+      <w:bookmarkEnd w:id="86"/>
+      <w:bookmarkEnd w:id="87"/>
+    </w:p>
+    <w:p>
+      <w:pPr>
+        <w:pStyle w:val="Normalindentado3"/>
+      </w:pPr>
+      <w:r>
+        <w:t>Estructura modular dividida en los componentes (Cotización, Oportunidades, Solicitudes, Clientes y Ayuda) para facilitar correcciones sin afectar todo el código.</w:t>
+      </w:r>
+    </w:p>
+    <w:p>
+      <w:pPr>
+        <w:pStyle w:val="Ttulo3"/>
+      </w:pPr>
+      <w:bookmarkStart w:id="88" w:name="_Toc33238263"/>
+      <w:bookmarkStart w:id="89" w:name="_Toc33411090"/>
+      <w:bookmarkStart w:id="90" w:name="_Toc235463730"/>
+      <w:r>
+        <w:t>Portabilidad</w:t>
       </w:r>
       <w:bookmarkEnd w:id="88"/>
       <w:bookmarkEnd w:id="89"/>
       <w:bookmarkEnd w:id="90"/>
-    </w:p>
-    <w:p>
-      <w:pPr>
-        <w:pStyle w:val="Normalindentado3"/>
-      </w:pPr>
-      <w:r>
-        <w:t>Estructura modular dividida en los componentes (Cotización, Oportunidades, Solicitudes, Clientes y Ayuda) para facilitar correcciones sin afectar todo el código.</w:t>
-      </w:r>
-    </w:p>
-    <w:p>
-      <w:pPr>
-        <w:pStyle w:val="Ttulo3"/>
-      </w:pPr>
-      <w:bookmarkStart w:id="91" w:name="_Toc33238263"/>
-      <w:bookmarkStart w:id="92" w:name="_Toc33411090"/>
-      <w:bookmarkStart w:id="93" w:name="_Toc235463730"/>
-      <w:r>
-        <w:t>Portabilidad</w:t>
-      </w:r>
-      <w:bookmarkEnd w:id="91"/>
-      <w:bookmarkEnd w:id="92"/>
-      <w:bookmarkEnd w:id="93"/>
     </w:p>
     <w:p>
       <w:pPr>
@@ -10932,14 +10321,7 @@
           <w:i w:val="0"/>
           <w:color w:val="auto"/>
         </w:rPr>
-        <w:t>El sistema debe empaquetarse exclusivamente para plataformas móviles (iOS/Android), garantizando su operación en la calle.</w:t>
-      </w:r>
-      <w:r>
-        <w:rPr>
-          <w:i w:val="0"/>
-          <w:color w:val="auto"/>
-        </w:rPr>
-        <w:t xml:space="preserve"> </w:t>
+        <w:t xml:space="preserve">El sistema debe empaquetarse exclusivamente para plataformas móviles (iOS/Android), garantizando su operación en la calle. </w:t>
       </w:r>
     </w:p>
     <w:p>
@@ -10952,24 +10334,24 @@
       <w:pPr>
         <w:pStyle w:val="Ttulo2"/>
       </w:pPr>
-      <w:bookmarkStart w:id="94" w:name="_Toc33411091"/>
-      <w:bookmarkStart w:id="95" w:name="_Toc235463731"/>
+      <w:bookmarkStart w:id="91" w:name="_Toc33411091"/>
+      <w:bookmarkStart w:id="92" w:name="_Toc235463731"/>
       <w:r>
         <w:lastRenderedPageBreak/>
         <w:t>Otros requisitos</w:t>
       </w:r>
-      <w:bookmarkEnd w:id="94"/>
-      <w:bookmarkEnd w:id="95"/>
+      <w:bookmarkEnd w:id="91"/>
+      <w:bookmarkEnd w:id="92"/>
     </w:p>
     <w:p>
       <w:pPr>
         <w:pStyle w:val="Ttulo3"/>
       </w:pPr>
-      <w:bookmarkStart w:id="96" w:name="_Toc235463732"/>
+      <w:bookmarkStart w:id="93" w:name="_Toc235463732"/>
       <w:r>
         <w:t>Requisitos Legales y de Dominio</w:t>
       </w:r>
-      <w:bookmarkEnd w:id="96"/>
+      <w:bookmarkEnd w:id="93"/>
     </w:p>
     <w:p>
       <w:pPr>
@@ -10981,13 +10363,7 @@
         <w:pStyle w:val="Normalindentado2"/>
       </w:pPr>
       <w:r>
-        <w:t xml:space="preserve">Exigencia de soporte físico manuscrito: Por regulaciones legales en México, el </w:t>
-      </w:r>
-      <w:r>
-        <w:t>o</w:t>
-      </w:r>
-      <w:r>
-        <w:t>torgamiento requiere la firma de puño y letra en la sucursal.</w:t>
+        <w:t>Exigencia de soporte físico manuscrito: Por regulaciones legales en México, el otorgamiento requiere la firma de puño y letra en la sucursal.</w:t>
       </w:r>
     </w:p>
     <w:p>
@@ -11012,11 +10388,11 @@
       <w:pPr>
         <w:pStyle w:val="Ttulo3"/>
       </w:pPr>
-      <w:bookmarkStart w:id="97" w:name="_Toc235463733"/>
+      <w:bookmarkStart w:id="94" w:name="_Toc235463733"/>
       <w:r>
         <w:t>Control de Datos</w:t>
       </w:r>
-      <w:bookmarkEnd w:id="97"/>
+      <w:bookmarkEnd w:id="94"/>
     </w:p>
     <w:p>
       <w:pPr>
@@ -11030,34 +10406,6 @@
       <w:r>
         <w:t>Caducidad Automática de Datos: El sistema debe invalidar la memoria caché del celular si las tasas de interés cambiaron en el servidor central, forzando la actualización antes de cotizar.</w:t>
       </w:r>
-    </w:p>
-    <w:p>
-      <w:pPr>
-        <w:pStyle w:val="Ttulo1"/>
-      </w:pPr>
-      <w:bookmarkStart w:id="98" w:name="_Toc33238265"/>
-      <w:bookmarkStart w:id="99" w:name="_Toc33411092"/>
-      <w:bookmarkStart w:id="100" w:name="_Toc235463734"/>
-      <w:r>
-        <w:t>Apéndices</w:t>
-      </w:r>
-      <w:bookmarkEnd w:id="98"/>
-      <w:bookmarkEnd w:id="99"/>
-      <w:bookmarkEnd w:id="100"/>
-    </w:p>
-    <w:p>
-      <w:pPr>
-        <w:pStyle w:val="Normalindentado1"/>
-      </w:pPr>
-      <w:r>
-        <w:t>Que va aquí?</w:t>
-      </w:r>
-    </w:p>
-    <w:p>
-      <w:pPr>
-        <w:pStyle w:val="guiazul"/>
-        <w:ind w:left="300"/>
-      </w:pPr>
     </w:p>
     <w:sectPr>
       <w:headerReference w:type="first" r:id="rId18"/>
@@ -11170,18 +10518,8 @@
               <w:color w:val="241A61"/>
               <w:sz w:val="16"/>
             </w:rPr>
-            <w:t xml:space="preserve">Descripción de requisitos del </w:t>
+            <w:t>Descripción de requisitos del sofware</w:t>
           </w:r>
-          <w:proofErr w:type="spellStart"/>
-          <w:r>
-            <w:rPr>
-              <w:rFonts w:cs="Arial"/>
-              <w:color w:val="241A61"/>
-              <w:sz w:val="16"/>
-            </w:rPr>
-            <w:t>sofware</w:t>
-          </w:r>
-          <w:proofErr w:type="spellEnd"/>
         </w:p>
       </w:tc>
     </w:tr>
@@ -11481,9 +10819,9 @@
       <w:tblLook w:val="0000" w:firstRow="0" w:lastRow="0" w:firstColumn="0" w:lastColumn="0" w:noHBand="0" w:noVBand="0"/>
     </w:tblPr>
     <w:tblGrid>
-      <w:gridCol w:w="1919"/>
-      <w:gridCol w:w="5055"/>
-      <w:gridCol w:w="1530"/>
+      <w:gridCol w:w="1923"/>
+      <w:gridCol w:w="5052"/>
+      <w:gridCol w:w="1529"/>
     </w:tblGrid>
     <w:tr>
       <w:tc>
@@ -11510,9 +10848,9 @@
               <w:sz w:val="16"/>
             </w:rPr>
             <w:drawing>
-              <wp:inline distT="0" distB="0" distL="0" distR="0" wp14:anchorId="714000DA" wp14:editId="20031108">
-                <wp:extent cx="410927" cy="400050"/>
-                <wp:effectExtent l="0" t="0" r="8255" b="0"/>
+              <wp:inline distT="0" distB="0" distL="0" distR="0" wp14:anchorId="714000DA" wp14:editId="2E795827">
+                <wp:extent cx="556260" cy="372614"/>
+                <wp:effectExtent l="0" t="0" r="0" b="8890"/>
                 <wp:docPr id="2" name="Imagen 2"/>
                 <wp:cNvGraphicFramePr>
                   <a:graphicFrameLocks xmlns:a="http://schemas.openxmlformats.org/drawingml/2006/main" noChangeAspect="1"/>
@@ -11526,7 +10864,7 @@
                           <a:picLocks noChangeAspect="1" noChangeArrowheads="1"/>
                         </pic:cNvPicPr>
                       </pic:nvPicPr>
-                      <pic:blipFill>
+                      <pic:blipFill rotWithShape="1">
                         <a:blip r:embed="rId1">
                           <a:extLst>
                             <a:ext uri="{28A0092B-C50C-407E-A947-70E740481C1C}">
@@ -11534,6 +10872,7 @@
                             </a:ext>
                           </a:extLst>
                         </a:blip>
+                        <a:srcRect t="17225" b="15789"/>
                         <a:stretch>
                           <a:fillRect/>
                         </a:stretch>
@@ -11541,7 +10880,7 @@
                       <pic:spPr bwMode="auto">
                         <a:xfrm>
                           <a:off x="0" y="0"/>
-                          <a:ext cx="410927" cy="400050"/>
+                          <a:ext cx="558783" cy="374304"/>
                         </a:xfrm>
                         <a:prstGeom prst="rect">
                           <a:avLst/>
@@ -11550,6 +10889,11 @@
                         <a:ln>
                           <a:noFill/>
                         </a:ln>
+                        <a:extLst>
+                          <a:ext uri="{53640926-AAD7-44D8-BBD7-CCE9431645EC}">
+                            <a14:shadowObscured xmlns:a14="http://schemas.microsoft.com/office/drawing/2010/main"/>
+                          </a:ext>
+                        </a:extLst>
                       </pic:spPr>
                     </pic:pic>
                   </a:graphicData>
@@ -14925,7 +14269,7 @@
       <w:ind w:left="4252"/>
     </w:pPr>
   </w:style>
-  <w:style w:type="paragraph" w:styleId="Firmadecorreoelectrnico">
+  <w:style w:type="paragraph" w:styleId="Firmadecorreo">
     <w:name w:val="E-mail Signature"/>
     <w:basedOn w:val="Normal"/>
   </w:style>
@@ -15545,6 +14889,17 @@
       <w:lang w:val="es-MX" w:eastAsia="es-MX"/>
     </w:rPr>
   </w:style>
+  <w:style w:type="paragraph" w:styleId="Prrafodelista">
+    <w:name w:val="List Paragraph"/>
+    <w:basedOn w:val="Normal"/>
+    <w:uiPriority w:val="34"/>
+    <w:qFormat/>
+    <w:rsid w:val="00784B1A"/>
+    <w:pPr>
+      <w:ind w:left="720"/>
+      <w:contextualSpacing/>
+    </w:pPr>
+  </w:style>
 </w:styles>
 </file>
 
@@ -15844,15 +15199,6 @@
 </file>
 
 <file path=customXml/item1.xml><?xml version="1.0" encoding="utf-8"?>
-<?mso-contentType ?>
-<FormTemplates xmlns="http://schemas.microsoft.com/sharepoint/v3/contenttype/forms">
-  <Display>DocumentLibraryForm</Display>
-  <Edit>DocumentLibraryForm</Edit>
-  <New>DocumentLibraryForm</New>
-</FormTemplates>
-</file>
-
-<file path=customXml/item2.xml><?xml version="1.0" encoding="utf-8"?>
 <ct:contentTypeSchema xmlns:ct="http://schemas.microsoft.com/office/2006/metadata/contentType" xmlns:ma="http://schemas.microsoft.com/office/2006/metadata/properties/metaAttributes" ct:_="" ma:_="" ma:contentTypeName="Document" ma:contentTypeID="0x010100C4D8C2822012C745A04DAD716F3BBC49" ma:contentTypeVersion="3" ma:contentTypeDescription="Create a new document." ma:contentTypeScope="" ma:versionID="22e449cb79a113e2a4c6c520348d9a82">
   <xsd:schema xmlns:xsd="http://www.w3.org/2001/XMLSchema" xmlns:xs="http://www.w3.org/2001/XMLSchema" xmlns:p="http://schemas.microsoft.com/office/2006/metadata/properties" xmlns:ns2="c874e5e4-5e19-40c3-b9bf-93ae489ed224" targetNamespace="http://schemas.microsoft.com/office/2006/metadata/properties" ma:root="true" ma:fieldsID="5541cf0c11fc23ffbfc0e2753c01e082" ns2:_="">
     <xsd:import namespace="c874e5e4-5e19-40c3-b9bf-93ae489ed224"/>
@@ -15990,25 +15336,26 @@
 </ct:contentTypeSchema>
 </file>
 
+<file path=customXml/item2.xml><?xml version="1.0" encoding="utf-8"?>
+<?mso-contentType ?>
+<FormTemplates xmlns="http://schemas.microsoft.com/sharepoint/v3/contenttype/forms">
+  <Display>DocumentLibraryForm</Display>
+  <Edit>DocumentLibraryForm</Edit>
+  <New>DocumentLibraryForm</New>
+</FormTemplates>
+</file>
+
 <file path=customXml/item3.xml><?xml version="1.0" encoding="utf-8"?>
+<b:Sources xmlns:b="http://schemas.openxmlformats.org/officeDocument/2006/bibliography" xmlns="http://schemas.openxmlformats.org/officeDocument/2006/bibliography" SelectedStyle="\APASixthEditionOfficeOnline.xsl" StyleName="APA" Version="6"/>
+</file>
+
+<file path=customXml/item4.xml><?xml version="1.0" encoding="utf-8"?>
 <p:properties xmlns:p="http://schemas.microsoft.com/office/2006/metadata/properties" xmlns:xsi="http://www.w3.org/2001/XMLSchema-instance" xmlns:pc="http://schemas.microsoft.com/office/infopath/2007/PartnerControls">
   <documentManagement/>
 </p:properties>
 </file>
 
-<file path=customXml/item4.xml><?xml version="1.0" encoding="utf-8"?>
-<b:Sources xmlns:b="http://schemas.openxmlformats.org/officeDocument/2006/bibliography" xmlns="http://schemas.openxmlformats.org/officeDocument/2006/bibliography" SelectedStyle="\APASixthEditionOfficeOnline.xsl" StyleName="APA" Version="6"/>
-</file>
-
 <file path=customXml/itemProps1.xml><?xml version="1.0" encoding="utf-8"?>
-<ds:datastoreItem xmlns:ds="http://schemas.openxmlformats.org/officeDocument/2006/customXml" ds:itemID="{3150CBCF-CB53-4FA1-B8F2-650DD1A34A47}">
-  <ds:schemaRefs>
-    <ds:schemaRef ds:uri="http://schemas.microsoft.com/sharepoint/v3/contenttype/forms"/>
-  </ds:schemaRefs>
-</ds:datastoreItem>
-</file>
-
-<file path=customXml/itemProps2.xml><?xml version="1.0" encoding="utf-8"?>
 <ds:datastoreItem xmlns:ds="http://schemas.openxmlformats.org/officeDocument/2006/customXml" ds:itemID="{B762800D-0A04-4D74-A223-5CCFB5CCA684}">
   <ds:schemaRefs>
     <ds:schemaRef ds:uri="http://schemas.microsoft.com/office/2006/metadata/contentType"/>
@@ -16026,19 +15373,27 @@
 </ds:datastoreItem>
 </file>
 
+<file path=customXml/itemProps2.xml><?xml version="1.0" encoding="utf-8"?>
+<ds:datastoreItem xmlns:ds="http://schemas.openxmlformats.org/officeDocument/2006/customXml" ds:itemID="{3150CBCF-CB53-4FA1-B8F2-650DD1A34A47}">
+  <ds:schemaRefs>
+    <ds:schemaRef ds:uri="http://schemas.microsoft.com/sharepoint/v3/contenttype/forms"/>
+  </ds:schemaRefs>
+</ds:datastoreItem>
+</file>
+
 <file path=customXml/itemProps3.xml><?xml version="1.0" encoding="utf-8"?>
+<ds:datastoreItem xmlns:ds="http://schemas.openxmlformats.org/officeDocument/2006/customXml" ds:itemID="{98211D8D-C047-49A3-9424-2548D01C90AD}">
+  <ds:schemaRefs>
+    <ds:schemaRef ds:uri="http://schemas.openxmlformats.org/officeDocument/2006/bibliography"/>
+  </ds:schemaRefs>
+</ds:datastoreItem>
+</file>
+
+<file path=customXml/itemProps4.xml><?xml version="1.0" encoding="utf-8"?>
 <ds:datastoreItem xmlns:ds="http://schemas.openxmlformats.org/officeDocument/2006/customXml" ds:itemID="{82EFE2AF-DC09-4CAC-B4BF-550B4A378594}">
   <ds:schemaRefs>
     <ds:schemaRef ds:uri="http://schemas.microsoft.com/office/2006/metadata/properties"/>
     <ds:schemaRef ds:uri="http://schemas.microsoft.com/office/infopath/2007/PartnerControls"/>
   </ds:schemaRefs>
 </ds:datastoreItem>
-</file>
-
-<file path=customXml/itemProps4.xml><?xml version="1.0" encoding="utf-8"?>
-<ds:datastoreItem xmlns:ds="http://schemas.openxmlformats.org/officeDocument/2006/customXml" ds:itemID="{98211D8D-C047-49A3-9424-2548D01C90AD}">
-  <ds:schemaRefs>
-    <ds:schemaRef ds:uri="http://schemas.openxmlformats.org/officeDocument/2006/bibliography"/>
-  </ds:schemaRefs>
-</ds:datastoreItem>
 </file>
</xml_diff>